<commit_message>
Fix report page limit and AI assistance wording
</commit_message>
<xml_diff>
--- a/docs/report.docx
+++ b/docs/report.docx
@@ -914,7 +914,11 @@
     </w:p>
     <w:p>
       <w:r>
-        <w:t>The students carried out the main work by understanding the topic, defining the project goals, planning the implementation, and making the key technical decisions. AI tools, including Codex and ChatGPT, were used as supporting resources to assist with completing tasks, generating initial code and configurations, correcting errors, debugging issues, and checking the implementation. Hasan managed the public branches and pull requests, while Love worked on CI improvements and versionforwarding issues. PR #4 documents the review and reproduction process. AI-assisted commits are labelled [Codex], and docs/ai-use.md describes how AI was used, the corrections made by the students, and the verification limitations. Both students reviewed the final output, ensured it met the project requirements, and are responsible for understanding and explaining the complete system</w:t>
+        <w:rPr>
+          <w:rFonts w:ascii="Arial" w:hAnsi="Arial"/>
+          <w:sz w:val="22"/>
+        </w:rPr>
+        <w:t>We defined the project goals and reviewed the generated output. Codex and ChatGPT helped generate the implementation baseline, tests, configuration and report and supported debugging. Hasan managed branches and pull requests and executed the release and VM checks. Love contributed CI and corrected version forwarding. PR #4 records review and reproduction. Some AI-assisted commits use [Codex]; docs/ai-use.md records the assistance, corrections and verification limits. We remain responsible for understanding and explaining the system.</w:t>
       </w:r>
     </w:p>
     <w:p>

</xml_diff>